<commit_message>
Successful deployment of java app on EKS cluster using helm charts. (microservice app)
</commit_message>
<xml_diff>
--- a/Successful deployment of java app on EKS cluster using helm charts.docx
+++ b/Successful deployment of java app on EKS cluster using helm charts.docx
@@ -12,6 +12,203 @@
     </w:p>
     <w:p>
       <w:r>
+        <w:drawing>
+          <wp:inline distT="0" distB="0" distL="0" distR="0" wp14:anchorId="57B2CCE0" wp14:editId="250D6097">
+            <wp:extent cx="5943600" cy="3108325"/>
+            <wp:effectExtent l="0" t="0" r="0" b="0"/>
+            <wp:docPr id="1669775537" name="Picture 1"/>
+            <wp:cNvGraphicFramePr>
+              <a:graphicFrameLocks xmlns:a="http://schemas.openxmlformats.org/drawingml/2006/main" noChangeAspect="1"/>
+            </wp:cNvGraphicFramePr>
+            <a:graphic xmlns:a="http://schemas.openxmlformats.org/drawingml/2006/main">
+              <a:graphicData uri="http://schemas.openxmlformats.org/drawingml/2006/picture">
+                <pic:pic xmlns:pic="http://schemas.openxmlformats.org/drawingml/2006/picture">
+                  <pic:nvPicPr>
+                    <pic:cNvPr id="1669775537" name=""/>
+                    <pic:cNvPicPr/>
+                  </pic:nvPicPr>
+                  <pic:blipFill>
+                    <a:blip r:embed="rId4"/>
+                    <a:stretch>
+                      <a:fillRect/>
+                    </a:stretch>
+                  </pic:blipFill>
+                  <pic:spPr>
+                    <a:xfrm>
+                      <a:off x="0" y="0"/>
+                      <a:ext cx="5943600" cy="3108325"/>
+                    </a:xfrm>
+                    <a:prstGeom prst="rect">
+                      <a:avLst/>
+                    </a:prstGeom>
+                  </pic:spPr>
+                </pic:pic>
+              </a:graphicData>
+            </a:graphic>
+          </wp:inline>
+        </w:drawing>
+      </w:r>
+    </w:p>
+    <w:p>
+      <w:r>
+        <w:drawing>
+          <wp:inline distT="0" distB="0" distL="0" distR="0" wp14:anchorId="4C0FB9E1" wp14:editId="50EB19C2">
+            <wp:extent cx="5943600" cy="2791460"/>
+            <wp:effectExtent l="0" t="0" r="0" b="8890"/>
+            <wp:docPr id="1666956248" name="Picture 1"/>
+            <wp:cNvGraphicFramePr>
+              <a:graphicFrameLocks xmlns:a="http://schemas.openxmlformats.org/drawingml/2006/main" noChangeAspect="1"/>
+            </wp:cNvGraphicFramePr>
+            <a:graphic xmlns:a="http://schemas.openxmlformats.org/drawingml/2006/main">
+              <a:graphicData uri="http://schemas.openxmlformats.org/drawingml/2006/picture">
+                <pic:pic xmlns:pic="http://schemas.openxmlformats.org/drawingml/2006/picture">
+                  <pic:nvPicPr>
+                    <pic:cNvPr id="1666956248" name=""/>
+                    <pic:cNvPicPr/>
+                  </pic:nvPicPr>
+                  <pic:blipFill>
+                    <a:blip r:embed="rId5"/>
+                    <a:stretch>
+                      <a:fillRect/>
+                    </a:stretch>
+                  </pic:blipFill>
+                  <pic:spPr>
+                    <a:xfrm>
+                      <a:off x="0" y="0"/>
+                      <a:ext cx="5943600" cy="2791460"/>
+                    </a:xfrm>
+                    <a:prstGeom prst="rect">
+                      <a:avLst/>
+                    </a:prstGeom>
+                  </pic:spPr>
+                </pic:pic>
+              </a:graphicData>
+            </a:graphic>
+          </wp:inline>
+        </w:drawing>
+      </w:r>
+    </w:p>
+    <w:p>
+      <w:r>
+        <w:lastRenderedPageBreak/>
+        <w:drawing>
+          <wp:inline distT="0" distB="0" distL="0" distR="0" wp14:anchorId="5104CE55" wp14:editId="06957A24">
+            <wp:extent cx="5943600" cy="3270885"/>
+            <wp:effectExtent l="0" t="0" r="0" b="5715"/>
+            <wp:docPr id="755933913" name="Picture 1"/>
+            <wp:cNvGraphicFramePr>
+              <a:graphicFrameLocks xmlns:a="http://schemas.openxmlformats.org/drawingml/2006/main" noChangeAspect="1"/>
+            </wp:cNvGraphicFramePr>
+            <a:graphic xmlns:a="http://schemas.openxmlformats.org/drawingml/2006/main">
+              <a:graphicData uri="http://schemas.openxmlformats.org/drawingml/2006/picture">
+                <pic:pic xmlns:pic="http://schemas.openxmlformats.org/drawingml/2006/picture">
+                  <pic:nvPicPr>
+                    <pic:cNvPr id="755933913" name=""/>
+                    <pic:cNvPicPr/>
+                  </pic:nvPicPr>
+                  <pic:blipFill>
+                    <a:blip r:embed="rId6"/>
+                    <a:stretch>
+                      <a:fillRect/>
+                    </a:stretch>
+                  </pic:blipFill>
+                  <pic:spPr>
+                    <a:xfrm>
+                      <a:off x="0" y="0"/>
+                      <a:ext cx="5943600" cy="3270885"/>
+                    </a:xfrm>
+                    <a:prstGeom prst="rect">
+                      <a:avLst/>
+                    </a:prstGeom>
+                  </pic:spPr>
+                </pic:pic>
+              </a:graphicData>
+            </a:graphic>
+          </wp:inline>
+        </w:drawing>
+      </w:r>
+    </w:p>
+    <w:p>
+      <w:r>
+        <w:drawing>
+          <wp:inline distT="0" distB="0" distL="0" distR="0" wp14:anchorId="317FA105" wp14:editId="042585C5">
+            <wp:extent cx="5943600" cy="1527810"/>
+            <wp:effectExtent l="0" t="0" r="0" b="0"/>
+            <wp:docPr id="11874494" name="Picture 1"/>
+            <wp:cNvGraphicFramePr>
+              <a:graphicFrameLocks xmlns:a="http://schemas.openxmlformats.org/drawingml/2006/main" noChangeAspect="1"/>
+            </wp:cNvGraphicFramePr>
+            <a:graphic xmlns:a="http://schemas.openxmlformats.org/drawingml/2006/main">
+              <a:graphicData uri="http://schemas.openxmlformats.org/drawingml/2006/picture">
+                <pic:pic xmlns:pic="http://schemas.openxmlformats.org/drawingml/2006/picture">
+                  <pic:nvPicPr>
+                    <pic:cNvPr id="11874494" name=""/>
+                    <pic:cNvPicPr/>
+                  </pic:nvPicPr>
+                  <pic:blipFill>
+                    <a:blip r:embed="rId7"/>
+                    <a:stretch>
+                      <a:fillRect/>
+                    </a:stretch>
+                  </pic:blipFill>
+                  <pic:spPr>
+                    <a:xfrm>
+                      <a:off x="0" y="0"/>
+                      <a:ext cx="5943600" cy="1527810"/>
+                    </a:xfrm>
+                    <a:prstGeom prst="rect">
+                      <a:avLst/>
+                    </a:prstGeom>
+                  </pic:spPr>
+                </pic:pic>
+              </a:graphicData>
+            </a:graphic>
+          </wp:inline>
+        </w:drawing>
+      </w:r>
+    </w:p>
+    <w:p>
+      <w:r>
+        <w:drawing>
+          <wp:inline distT="0" distB="0" distL="0" distR="0" wp14:anchorId="29C6B0B0" wp14:editId="3ACD3124">
+            <wp:extent cx="5943600" cy="1581785"/>
+            <wp:effectExtent l="0" t="0" r="0" b="0"/>
+            <wp:docPr id="1212003349" name="Picture 1"/>
+            <wp:cNvGraphicFramePr>
+              <a:graphicFrameLocks xmlns:a="http://schemas.openxmlformats.org/drawingml/2006/main" noChangeAspect="1"/>
+            </wp:cNvGraphicFramePr>
+            <a:graphic xmlns:a="http://schemas.openxmlformats.org/drawingml/2006/main">
+              <a:graphicData uri="http://schemas.openxmlformats.org/drawingml/2006/picture">
+                <pic:pic xmlns:pic="http://schemas.openxmlformats.org/drawingml/2006/picture">
+                  <pic:nvPicPr>
+                    <pic:cNvPr id="1212003349" name=""/>
+                    <pic:cNvPicPr/>
+                  </pic:nvPicPr>
+                  <pic:blipFill>
+                    <a:blip r:embed="rId8"/>
+                    <a:stretch>
+                      <a:fillRect/>
+                    </a:stretch>
+                  </pic:blipFill>
+                  <pic:spPr>
+                    <a:xfrm>
+                      <a:off x="0" y="0"/>
+                      <a:ext cx="5943600" cy="1581785"/>
+                    </a:xfrm>
+                    <a:prstGeom prst="rect">
+                      <a:avLst/>
+                    </a:prstGeom>
+                  </pic:spPr>
+                </pic:pic>
+              </a:graphicData>
+            </a:graphic>
+          </wp:inline>
+        </w:drawing>
+      </w:r>
+    </w:p>
+    <w:p>
+      <w:r>
+        <w:lastRenderedPageBreak/>
         <w:drawing>
           <wp:inline distT="0" distB="0" distL="0" distR="0" wp14:anchorId="1C8B801B" wp14:editId="36C04556">
             <wp:extent cx="5943600" cy="1665605"/>
@@ -28,7 +225,7 @@
                     <pic:cNvPicPr/>
                   </pic:nvPicPr>
                   <pic:blipFill>
-                    <a:blip r:embed="rId4"/>
+                    <a:blip r:embed="rId9"/>
                     <a:stretch>
                       <a:fillRect/>
                     </a:stretch>
@@ -67,7 +264,7 @@
                     <pic:cNvPicPr/>
                   </pic:nvPicPr>
                   <pic:blipFill>
-                    <a:blip r:embed="rId5"/>
+                    <a:blip r:embed="rId10"/>
                     <a:stretch>
                       <a:fillRect/>
                     </a:stretch>
@@ -109,7 +306,7 @@
                     <pic:cNvPicPr/>
                   </pic:nvPicPr>
                   <pic:blipFill>
-                    <a:blip r:embed="rId6"/>
+                    <a:blip r:embed="rId11"/>
                     <a:stretch>
                       <a:fillRect/>
                     </a:stretch>
@@ -148,7 +345,7 @@
                     <pic:cNvPicPr/>
                   </pic:nvPicPr>
                   <pic:blipFill>
-                    <a:blip r:embed="rId7"/>
+                    <a:blip r:embed="rId12"/>
                     <a:stretch>
                       <a:fillRect/>
                     </a:stretch>

</xml_diff>